<commit_message>
Rebuilt templates and a social post maker
Slides: 15 layouts with placeholders, a cover per business leaning red or blue,
17 worked slides. Report with cover, contents and full styles; a new letter;
signature lockups per business. Generators live in tools/templates (npm run
templates). The kit keeps download sizes right.

social/ is a post maker: seven post types in four formats, per business, on
black, white or blueprint, exported as PNG or SVG. Its renderer also draws the
SVG frames, and the check covers it in every browser.

Co-Authored-By: Claude Opus 5.5 <noreply@anthropic.com>
Claude-Session: https://claude.ai/code/session_01PRTuNkjnDS69NQcNRoCJq8
</commit_message>
<xml_diff>
--- a/assets/templates/smedley-group-document.docx
+++ b/assets/templates/smedley-group-document.docx
@@ -4,39 +4,14 @@
   <w:body>
     <w:p>
       <w:pPr>
-        <w:pStyle w:val="Label"/>
-        <w:spacing w:after="120" w:before="480"/>
-      </w:pPr>
-      <w:r>
-        <w:t xml:space="preserve">Report</w:t>
-      </w:r>
-    </w:p>
-    <w:p>
-      <w:pPr>
-        <w:pStyle w:val="Title"/>
-      </w:pPr>
-      <w:r>
-        <w:t xml:space="preserve">Document title in sentence case</w:t>
-      </w:r>
-    </w:p>
-    <w:p>
-      <w:pPr>
-        <w:pStyle w:val="Subtitle"/>
-      </w:pPr>
-      <w:r>
-        <w:t xml:space="preserve">A subtitle that says who it is for and why</w:t>
-      </w:r>
-    </w:p>
-    <w:p>
-      <w:pPr>
-        <w:spacing w:after="120"/>
+        <w:spacing w:after="3600"/>
       </w:pPr>
       <w:r>
         <w:drawing>
           <wp:inline distT="0" distB="0" distL="0" distR="0">
-            <wp:extent cx="5734050" cy="85725"/>
+            <wp:extent cx="1314450" cy="571500"/>
             <wp:effectExtent t="0" r="0" b="0" l="0"/>
-            <wp:docPr id="1" name="" descr="" title=""/>
+            <wp:docPr id="1" name="Smedley Group" descr="Smedley Group" title="Smedley Group"/>
             <wp:cNvGraphicFramePr>
               <a:graphicFrameLocks xmlns:a="http://schemas.openxmlformats.org/drawingml/2006/main" noChangeAspect="1"/>
             </wp:cNvGraphicFramePr>
@@ -50,7 +25,76 @@
                     </pic:cNvPicPr>
                   </pic:nvPicPr>
                   <pic:blipFill>
-                    <a:blip r:embed="rId9" cstate="none"/>
+                    <a:blip r:embed="rId11" cstate="none"/>
+                    <a:srcRect/>
+                    <a:stretch>
+                      <a:fillRect/>
+                    </a:stretch>
+                  </pic:blipFill>
+                  <pic:spPr bwMode="auto">
+                    <a:xfrm>
+                      <a:off x="0" y="0"/>
+                      <a:ext cx="1314450" cy="571500"/>
+                    </a:xfrm>
+                    <a:prstGeom prst="rect">
+                      <a:avLst/>
+                    </a:prstGeom>
+                  </pic:spPr>
+                </pic:pic>
+              </a:graphicData>
+            </a:graphic>
+          </wp:inline>
+        </w:drawing>
+      </w:r>
+    </w:p>
+    <w:p>
+      <w:pPr>
+        <w:pStyle w:val="Label"/>
+      </w:pPr>
+      <w:r>
+        <w:t xml:space="preserve">Report</w:t>
+      </w:r>
+    </w:p>
+    <w:p>
+      <w:pPr>
+        <w:pStyle w:val="Title"/>
+      </w:pPr>
+      <w:r>
+        <w:t xml:space="preserve">Document title in sentence case</w:t>
+      </w:r>
+    </w:p>
+    <w:p>
+      <w:pPr>
+        <w:pStyle w:val="Subtitle"/>
+      </w:pPr>
+      <w:r>
+        <w:t xml:space="preserve">A subtitle that says who it is for and why</w:t>
+      </w:r>
+    </w:p>
+    <w:p>
+      <w:pPr>
+        <w:spacing w:after="200"/>
+      </w:pPr>
+      <w:r>
+        <w:drawing>
+          <wp:inline distT="0" distB="0" distL="0" distR="0">
+            <wp:extent cx="5734050" cy="85725"/>
+            <wp:effectExtent t="0" r="0" b="0" l="0"/>
+            <wp:docPr id="1" name="Rule" descr="Red lead into a blue scale rule" title="Scale rule"/>
+            <wp:cNvGraphicFramePr>
+              <a:graphicFrameLocks xmlns:a="http://schemas.openxmlformats.org/drawingml/2006/main" noChangeAspect="1"/>
+            </wp:cNvGraphicFramePr>
+            <a:graphic xmlns:a="http://schemas.openxmlformats.org/drawingml/2006/main">
+              <a:graphicData uri="http://schemas.openxmlformats.org/drawingml/2006/picture">
+                <pic:pic xmlns:pic="http://schemas.openxmlformats.org/drawingml/2006/picture">
+                  <pic:nvPicPr>
+                    <pic:cNvPr id="0" name="" descr=""/>
+                    <pic:cNvPicPr>
+                      <a:picLocks noChangeAspect="1" noChangeArrowheads="1"/>
+                    </pic:cNvPicPr>
+                  </pic:nvPicPr>
+                  <pic:blipFill>
+                    <a:blip r:embed="rId12" cstate="none"/>
                     <a:srcRect/>
                     <a:stretch>
                       <a:fillRect/>
@@ -74,10 +118,77 @@
     </w:p>
     <w:p>
       <w:pPr>
+        <w:pStyle w:val="Small"/>
+      </w:pPr>
+      <w:r>
+        <w:t xml:space="preserve">Smedley Group</w:t>
+      </w:r>
+      <w:r>
+        <w:rPr>
+          <w:color w:val="585D65"/>
+        </w:rPr>
+        <w:t xml:space="preserve">   September 2026   </w:t>
+      </w:r>
+      <w:r>
+        <w:t xml:space="preserve">Version 1.0</w:t>
+      </w:r>
+    </w:p>
+    <w:p>
+      <w:pPr>
+        <w:pStyle w:val="Small"/>
+        <w:spacing w:before="60"/>
+      </w:pPr>
+      <w:r>
+        <w:t xml:space="preserve">Author name, role</w:t>
+      </w:r>
+    </w:p>
+    <w:p>
+      <w:pPr>
+        <w:sectPr>
+          <w:headerReference w:type="first" r:id="rId7"/>
+          <w:footerReference w:type="first" r:id="rId8"/>
+          <w:pgSz w:w="11906" w:h="16838" w:orient="portrait"/>
+          <w:pgMar w:top="1080" w:right="1440" w:bottom="1080" w:left="1440" w:header="708" w:footer="708" w:gutter="0"/>
+          <w:pgNumType/>
+          <w:titlePg/>
+          <w:docGrid w:linePitch="360"/>
+        </w:sectPr>
+      </w:pPr>
+    </w:p>
+    <w:p>
+      <w:pPr>
+        <w:pStyle w:val="Heading1"/>
+        <w:spacing w:after="200" w:before="0"/>
+      </w:pPr>
+      <w:r>
+        <w:t xml:space="preserve">Contents</w:t>
+      </w:r>
+    </w:p>
+    <w:sdt>
+      <w:sdtPr>
+        <w:alias w:val="Contents"/>
+      </w:sdtPr>
+      <w:sdtContent>
+        <w:p>
+          <w:r>
+            <w:fldChar w:fldCharType="begin" w:dirty="true"/>
+            <w:instrText xml:space="preserve">TOC \h \o "1-2"</w:instrText>
+            <w:fldChar w:fldCharType="separate"/>
+          </w:r>
+        </w:p>
+        <w:p>
+          <w:r>
+            <w:fldChar w:fldCharType="end"/>
+          </w:r>
+        </w:p>
+      </w:sdtContent>
+    </w:sdt>
+    <w:p>
+      <w:pPr>
         <w:pStyle w:val="Caption"/>
       </w:pPr>
       <w:r>
-        <w:t xml:space="preserve">Smedley Group, September 2026</w:t>
+        <w:t xml:space="preserve">If the contents are empty, right-click them and choose Update field.</w:t>
       </w:r>
     </w:p>
     <w:p>
@@ -106,6 +217,14 @@
     </w:p>
     <w:p>
       <w:pPr>
+        <w:pStyle w:val="Note"/>
+      </w:pPr>
+      <w:r>
+        <w:t xml:space="preserve">Notes carry an aside the reader should not miss: a caveat, a dependency, a decision still open. They sit on a blue rule.</w:t>
+      </w:r>
+    </w:p>
+    <w:p>
+      <w:pPr>
         <w:pStyle w:val="Heading1"/>
       </w:pPr>
       <w:r>
@@ -118,6 +237,14 @@
       </w:pPr>
       <w:r>
         <w:t xml:space="preserve">Subheading</w:t>
+      </w:r>
+    </w:p>
+    <w:p>
+      <w:pPr>
+        <w:pStyle w:val="Heading3"/>
+      </w:pPr>
+      <w:r>
+        <w:t xml:space="preserve">Heading 3 labels a group of paragraphs</w:t>
       </w:r>
     </w:p>
     <w:p>
@@ -161,6 +288,54 @@
     </w:p>
     <w:p>
       <w:pPr>
+        <w:pStyle w:val="Body"/>
+        <w:spacing w:before="200"/>
+      </w:pPr>
+      <w:r>
+        <w:t xml:space="preserve">Steps in order are numbered in mono.</w:t>
+      </w:r>
+    </w:p>
+    <w:p>
+      <w:pPr>
+        <w:pStyle w:val="Body"/>
+        <w:numPr>
+          <w:ilvl w:val="0"/>
+          <w:numId w:val="3"/>
+        </w:numPr>
+        <w:spacing w:after="80"/>
+      </w:pPr>
+      <w:r>
+        <w:t xml:space="preserve">Book the test day</w:t>
+      </w:r>
+    </w:p>
+    <w:p>
+      <w:pPr>
+        <w:pStyle w:val="Body"/>
+        <w:numPr>
+          <w:ilvl w:val="0"/>
+          <w:numId w:val="3"/>
+        </w:numPr>
+        <w:spacing w:after="80"/>
+      </w:pPr>
+      <w:r>
+        <w:t xml:space="preserve">Confirm the driver and the car</w:t>
+      </w:r>
+    </w:p>
+    <w:p>
+      <w:pPr>
+        <w:pStyle w:val="Body"/>
+        <w:numPr>
+          <w:ilvl w:val="0"/>
+          <w:numId w:val="3"/>
+        </w:numPr>
+        <w:spacing w:after="80"/>
+      </w:pPr>
+      <w:r>
+        <w:t xml:space="preserve">Send the setup sheet the day before</w:t>
+      </w:r>
+    </w:p>
+    <w:p>
+      <w:pPr>
         <w:pStyle w:val="Heading2"/>
       </w:pPr>
       <w:r>
@@ -177,8 +352,8 @@
       <w:r>
         <w:rPr>
           <w:color w:val="D8231A"/>
-          <w:sz w:val="32"/>
-          <w:szCs w:val="32"/>
+          <w:sz w:val="36"/>
+          <w:szCs w:val="36"/>
         </w:rPr>
         <w:t xml:space="preserve"> %</w:t>
       </w:r>
@@ -194,7 +369,6 @@
     <w:p>
       <w:pPr>
         <w:pStyle w:val="Heading2"/>
-        <w:keepNext/>
       </w:pPr>
       <w:r>
         <w:t xml:space="preserve">Tables</w:t>
@@ -213,10 +387,10 @@
         </w:tblBorders>
       </w:tblPr>
       <w:tblGrid>
-        <w:gridCol w:w="3000"/>
-        <w:gridCol w:w="2009"/>
-        <w:gridCol w:w="2009"/>
-        <w:gridCol w:w="2008"/>
+        <w:gridCol w:w="3200"/>
+        <w:gridCol w:w="2626"/>
+        <w:gridCol w:w="1600"/>
+        <w:gridCol w:w="1600"/>
       </w:tblGrid>
       <w:tr>
         <w:trPr>
@@ -225,7 +399,7 @@
         </w:trPr>
         <w:tc>
           <w:tcPr>
-            <w:tcW w:type="dxa" w:w="3000"/>
+            <w:tcW w:type="dxa" w:w="3200"/>
             <w:tcBorders>
               <w:top w:val="none" w:color="FFFFFF" w:sz="0"/>
               <w:left w:val="none" w:color="FFFFFF" w:sz="0"/>
@@ -238,12 +412,15 @@
               <w:bottom w:type="dxa" w:w="90"/>
               <w:right w:type="dxa" w:w="120"/>
             </w:tcMar>
+            <w:vAlign w:val="center"/>
           </w:tcPr>
           <w:p>
             <w:pPr>
-              <w:pStyle w:val="Caption"/>
+              <w:pStyle w:val="Small"/>
               <w:keepNext/>
               <w:keepLines/>
+              <w:spacing w:after="0"/>
+              <w:jc w:val="left"/>
             </w:pPr>
             <w:r>
               <w:rPr>
@@ -256,7 +433,7 @@
         </w:tc>
         <w:tc>
           <w:tcPr>
-            <w:tcW w:type="dxa" w:w="2009"/>
+            <w:tcW w:type="dxa" w:w="2626"/>
             <w:tcBorders>
               <w:top w:val="none" w:color="FFFFFF" w:sz="0"/>
               <w:left w:val="none" w:color="FFFFFF" w:sz="0"/>
@@ -269,12 +446,15 @@
               <w:bottom w:type="dxa" w:w="90"/>
               <w:right w:type="dxa" w:w="120"/>
             </w:tcMar>
+            <w:vAlign w:val="center"/>
           </w:tcPr>
           <w:p>
             <w:pPr>
-              <w:pStyle w:val="Caption"/>
+              <w:pStyle w:val="Small"/>
               <w:keepNext/>
               <w:keepLines/>
+              <w:spacing w:after="0"/>
+              <w:jc w:val="left"/>
             </w:pPr>
             <w:r>
               <w:rPr>
@@ -287,7 +467,7 @@
         </w:tc>
         <w:tc>
           <w:tcPr>
-            <w:tcW w:type="dxa" w:w="2009"/>
+            <w:tcW w:type="dxa" w:w="1600"/>
             <w:tcBorders>
               <w:top w:val="none" w:color="FFFFFF" w:sz="0"/>
               <w:left w:val="none" w:color="FFFFFF" w:sz="0"/>
@@ -300,12 +480,15 @@
               <w:bottom w:type="dxa" w:w="90"/>
               <w:right w:type="dxa" w:w="120"/>
             </w:tcMar>
+            <w:vAlign w:val="center"/>
           </w:tcPr>
           <w:p>
             <w:pPr>
-              <w:pStyle w:val="Caption"/>
+              <w:pStyle w:val="Small"/>
               <w:keepNext/>
               <w:keepLines/>
+              <w:spacing w:after="0"/>
+              <w:jc w:val="right"/>
             </w:pPr>
             <w:r>
               <w:rPr>
@@ -318,7 +501,7 @@
         </w:tc>
         <w:tc>
           <w:tcPr>
-            <w:tcW w:type="dxa" w:w="2008"/>
+            <w:tcW w:type="dxa" w:w="1600"/>
             <w:tcBorders>
               <w:top w:val="none" w:color="FFFFFF" w:sz="0"/>
               <w:left w:val="none" w:color="FFFFFF" w:sz="0"/>
@@ -331,12 +514,15 @@
               <w:bottom w:type="dxa" w:w="90"/>
               <w:right w:type="dxa" w:w="120"/>
             </w:tcMar>
+            <w:vAlign w:val="center"/>
           </w:tcPr>
           <w:p>
             <w:pPr>
-              <w:pStyle w:val="Caption"/>
+              <w:pStyle w:val="Small"/>
               <w:keepNext/>
               <w:keepLines/>
+              <w:spacing w:after="0"/>
+              <w:jc w:val="right"/>
             </w:pPr>
             <w:r>
               <w:rPr>
@@ -354,7 +540,7 @@
         </w:trPr>
         <w:tc>
           <w:tcPr>
-            <w:tcW w:type="dxa" w:w="3000"/>
+            <w:tcW w:type="dxa" w:w="3200"/>
             <w:tcBorders>
               <w:top w:val="none" w:color="FFFFFF" w:sz="0"/>
               <w:left w:val="none" w:color="FFFFFF" w:sz="0"/>
@@ -367,12 +553,15 @@
               <w:bottom w:type="dxa" w:w="90"/>
               <w:right w:type="dxa" w:w="120"/>
             </w:tcMar>
+            <w:vAlign w:val="center"/>
           </w:tcPr>
           <w:p>
             <w:pPr>
               <w:pStyle w:val="Body"/>
               <w:keepNext/>
               <w:keepLines/>
+              <w:spacing w:after="0"/>
+              <w:jc w:val="left"/>
             </w:pPr>
             <w:r>
               <w:rPr>
@@ -385,7 +574,7 @@
         </w:tc>
         <w:tc>
           <w:tcPr>
-            <w:tcW w:type="dxa" w:w="2009"/>
+            <w:tcW w:type="dxa" w:w="2626"/>
             <w:tcBorders>
               <w:top w:val="none" w:color="FFFFFF" w:sz="0"/>
               <w:left w:val="none" w:color="FFFFFF" w:sz="0"/>
@@ -398,25 +587,28 @@
               <w:bottom w:type="dxa" w:w="90"/>
               <w:right w:type="dxa" w:w="120"/>
             </w:tcMar>
+            <w:vAlign w:val="center"/>
           </w:tcPr>
           <w:p>
             <w:pPr>
               <w:pStyle w:val="Body"/>
               <w:keepNext/>
               <w:keepLines/>
+              <w:spacing w:after="0"/>
+              <w:jc w:val="left"/>
             </w:pPr>
             <w:r>
               <w:rPr>
                 <w:b w:val="false"/>
                 <w:bCs w:val="false"/>
               </w:rPr>
-              <w:t xml:space="preserve">FKL Łódź</w:t>
+              <w:t xml:space="preserve">Łódź</w:t>
             </w:r>
           </w:p>
         </w:tc>
         <w:tc>
           <w:tcPr>
-            <w:tcW w:type="dxa" w:w="2009"/>
+            <w:tcW w:type="dxa" w:w="1600"/>
             <w:tcBorders>
               <w:top w:val="none" w:color="FFFFFF" w:sz="0"/>
               <w:left w:val="none" w:color="FFFFFF" w:sz="0"/>
@@ -429,12 +621,15 @@
               <w:bottom w:type="dxa" w:w="90"/>
               <w:right w:type="dxa" w:w="120"/>
             </w:tcMar>
+            <w:vAlign w:val="center"/>
           </w:tcPr>
           <w:p>
             <w:pPr>
               <w:pStyle w:val="Body"/>
               <w:keepNext/>
               <w:keepLines/>
+              <w:spacing w:after="0"/>
+              <w:jc w:val="right"/>
             </w:pPr>
             <w:r>
               <w:rPr>
@@ -448,7 +643,7 @@
         </w:tc>
         <w:tc>
           <w:tcPr>
-            <w:tcW w:type="dxa" w:w="2008"/>
+            <w:tcW w:type="dxa" w:w="1600"/>
             <w:tcBorders>
               <w:top w:val="none" w:color="FFFFFF" w:sz="0"/>
               <w:left w:val="none" w:color="FFFFFF" w:sz="0"/>
@@ -461,19 +656,22 @@
               <w:bottom w:type="dxa" w:w="90"/>
               <w:right w:type="dxa" w:w="120"/>
             </w:tcMar>
+            <w:vAlign w:val="center"/>
           </w:tcPr>
           <w:p>
             <w:pPr>
               <w:pStyle w:val="Body"/>
               <w:keepNext/>
               <w:keepLines/>
+              <w:spacing w:after="0"/>
+              <w:jc w:val="right"/>
             </w:pPr>
             <w:r>
               <w:rPr>
                 <w:rFonts w:ascii="IBM Plex Mono" w:cs="IBM Plex Mono" w:eastAsia="IBM Plex Mono" w:hAnsi="IBM Plex Mono"/>
                 <w:b w:val="false"/>
                 <w:bCs w:val="false"/>
-                <w:color w:val="00A04A"/>
+                <w:color w:val="007A38"/>
               </w:rPr>
               <w:t xml:space="preserve">+3.2</w:t>
             </w:r>
@@ -486,7 +684,7 @@
         </w:trPr>
         <w:tc>
           <w:tcPr>
-            <w:tcW w:type="dxa" w:w="3000"/>
+            <w:tcW w:type="dxa" w:w="3200"/>
             <w:tcBorders>
               <w:top w:val="none" w:color="FFFFFF" w:sz="0"/>
               <w:left w:val="none" w:color="FFFFFF" w:sz="0"/>
@@ -499,12 +697,15 @@
               <w:bottom w:type="dxa" w:w="90"/>
               <w:right w:type="dxa" w:w="120"/>
             </w:tcMar>
+            <w:vAlign w:val="center"/>
           </w:tcPr>
           <w:p>
             <w:pPr>
               <w:pStyle w:val="Body"/>
               <w:keepNext/>
               <w:keepLines/>
+              <w:spacing w:after="0"/>
+              <w:jc w:val="left"/>
             </w:pPr>
             <w:r>
               <w:rPr>
@@ -517,7 +718,7 @@
         </w:tc>
         <w:tc>
           <w:tcPr>
-            <w:tcW w:type="dxa" w:w="2009"/>
+            <w:tcW w:type="dxa" w:w="2626"/>
             <w:tcBorders>
               <w:top w:val="none" w:color="FFFFFF" w:sz="0"/>
               <w:left w:val="none" w:color="FFFFFF" w:sz="0"/>
@@ -530,25 +731,28 @@
               <w:bottom w:type="dxa" w:w="90"/>
               <w:right w:type="dxa" w:w="120"/>
             </w:tcMar>
+            <w:vAlign w:val="center"/>
           </w:tcPr>
           <w:p>
             <w:pPr>
               <w:pStyle w:val="Body"/>
               <w:keepNext/>
               <w:keepLines/>
+              <w:spacing w:after="0"/>
+              <w:jc w:val="left"/>
             </w:pPr>
             <w:r>
               <w:rPr>
                 <w:b w:val="false"/>
                 <w:bCs w:val="false"/>
               </w:rPr>
-              <w:t xml:space="preserve">FKL Milton Keynes</w:t>
+              <w:t xml:space="preserve">Milton Keynes</w:t>
             </w:r>
           </w:p>
         </w:tc>
         <w:tc>
           <w:tcPr>
-            <w:tcW w:type="dxa" w:w="2009"/>
+            <w:tcW w:type="dxa" w:w="1600"/>
             <w:tcBorders>
               <w:top w:val="none" w:color="FFFFFF" w:sz="0"/>
               <w:left w:val="none" w:color="FFFFFF" w:sz="0"/>
@@ -561,12 +765,15 @@
               <w:bottom w:type="dxa" w:w="90"/>
               <w:right w:type="dxa" w:w="120"/>
             </w:tcMar>
+            <w:vAlign w:val="center"/>
           </w:tcPr>
           <w:p>
             <w:pPr>
               <w:pStyle w:val="Body"/>
               <w:keepNext/>
               <w:keepLines/>
+              <w:spacing w:after="0"/>
+              <w:jc w:val="right"/>
             </w:pPr>
             <w:r>
               <w:rPr>
@@ -580,7 +787,7 @@
         </w:tc>
         <w:tc>
           <w:tcPr>
-            <w:tcW w:type="dxa" w:w="2008"/>
+            <w:tcW w:type="dxa" w:w="1600"/>
             <w:tcBorders>
               <w:top w:val="none" w:color="FFFFFF" w:sz="0"/>
               <w:left w:val="none" w:color="FFFFFF" w:sz="0"/>
@@ -593,19 +800,22 @@
               <w:bottom w:type="dxa" w:w="90"/>
               <w:right w:type="dxa" w:w="120"/>
             </w:tcMar>
+            <w:vAlign w:val="center"/>
           </w:tcPr>
           <w:p>
             <w:pPr>
               <w:pStyle w:val="Body"/>
               <w:keepNext/>
               <w:keepLines/>
+              <w:spacing w:after="0"/>
+              <w:jc w:val="right"/>
             </w:pPr>
             <w:r>
               <w:rPr>
                 <w:rFonts w:ascii="IBM Plex Mono" w:cs="IBM Plex Mono" w:eastAsia="IBM Plex Mono" w:hAnsi="IBM Plex Mono"/>
                 <w:b w:val="false"/>
                 <w:bCs w:val="false"/>
-                <w:color w:val="00A04A"/>
+                <w:color w:val="007A38"/>
               </w:rPr>
               <w:t xml:space="preserve">+1.1</w:t>
             </w:r>
@@ -618,7 +828,7 @@
         </w:trPr>
         <w:tc>
           <w:tcPr>
-            <w:tcW w:type="dxa" w:w="3000"/>
+            <w:tcW w:type="dxa" w:w="3200"/>
             <w:tcBorders>
               <w:top w:val="none" w:color="FFFFFF" w:sz="0"/>
               <w:left w:val="none" w:color="FFFFFF" w:sz="0"/>
@@ -631,12 +841,15 @@
               <w:bottom w:type="dxa" w:w="90"/>
               <w:right w:type="dxa" w:w="120"/>
             </w:tcMar>
+            <w:vAlign w:val="center"/>
           </w:tcPr>
           <w:p>
             <w:pPr>
               <w:pStyle w:val="Body"/>
               <w:keepNext w:val="false"/>
               <w:keepLines/>
+              <w:spacing w:after="0"/>
+              <w:jc w:val="left"/>
             </w:pPr>
             <w:r>
               <w:rPr>
@@ -649,7 +862,7 @@
         </w:tc>
         <w:tc>
           <w:tcPr>
-            <w:tcW w:type="dxa" w:w="2009"/>
+            <w:tcW w:type="dxa" w:w="2626"/>
             <w:tcBorders>
               <w:top w:val="none" w:color="FFFFFF" w:sz="0"/>
               <w:left w:val="none" w:color="FFFFFF" w:sz="0"/>
@@ -662,25 +875,28 @@
               <w:bottom w:type="dxa" w:w="90"/>
               <w:right w:type="dxa" w:w="120"/>
             </w:tcMar>
+            <w:vAlign w:val="center"/>
           </w:tcPr>
           <w:p>
             <w:pPr>
               <w:pStyle w:val="Body"/>
               <w:keepNext w:val="false"/>
               <w:keepLines/>
+              <w:spacing w:after="0"/>
+              <w:jc w:val="left"/>
             </w:pPr>
             <w:r>
               <w:rPr>
                 <w:b w:val="false"/>
                 <w:bCs w:val="false"/>
               </w:rPr>
-              <w:t xml:space="preserve">FKL Dubai</w:t>
+              <w:t xml:space="preserve">Dubai</w:t>
             </w:r>
           </w:p>
         </w:tc>
         <w:tc>
           <w:tcPr>
-            <w:tcW w:type="dxa" w:w="2009"/>
+            <w:tcW w:type="dxa" w:w="1600"/>
             <w:tcBorders>
               <w:top w:val="none" w:color="FFFFFF" w:sz="0"/>
               <w:left w:val="none" w:color="FFFFFF" w:sz="0"/>
@@ -693,12 +909,15 @@
               <w:bottom w:type="dxa" w:w="90"/>
               <w:right w:type="dxa" w:w="120"/>
             </w:tcMar>
+            <w:vAlign w:val="center"/>
           </w:tcPr>
           <w:p>
             <w:pPr>
               <w:pStyle w:val="Body"/>
               <w:keepNext w:val="false"/>
               <w:keepLines/>
+              <w:spacing w:after="0"/>
+              <w:jc w:val="right"/>
             </w:pPr>
             <w:r>
               <w:rPr>
@@ -712,7 +931,7 @@
         </w:tc>
         <w:tc>
           <w:tcPr>
-            <w:tcW w:type="dxa" w:w="2008"/>
+            <w:tcW w:type="dxa" w:w="1600"/>
             <w:tcBorders>
               <w:top w:val="none" w:color="FFFFFF" w:sz="0"/>
               <w:left w:val="none" w:color="FFFFFF" w:sz="0"/>
@@ -725,19 +944,22 @@
               <w:bottom w:type="dxa" w:w="90"/>
               <w:right w:type="dxa" w:w="120"/>
             </w:tcMar>
+            <w:vAlign w:val="center"/>
           </w:tcPr>
           <w:p>
             <w:pPr>
               <w:pStyle w:val="Body"/>
               <w:keepNext w:val="false"/>
               <w:keepLines/>
+              <w:spacing w:after="0"/>
+              <w:jc w:val="right"/>
             </w:pPr>
             <w:r>
               <w:rPr>
                 <w:rFonts w:ascii="IBM Plex Mono" w:cs="IBM Plex Mono" w:eastAsia="IBM Plex Mono" w:hAnsi="IBM Plex Mono"/>
                 <w:b w:val="false"/>
                 <w:bCs w:val="false"/>
-                <w:color w:val="00A04A"/>
+                <w:color w:val="007A38"/>
               </w:rPr>
               <w:t xml:space="preserve">+4.6</w:t>
             </w:r>
@@ -750,7 +972,31 @@
         <w:pStyle w:val="Caption"/>
       </w:pPr>
       <w:r>
-        <w:t xml:space="preserve">Tables use hairlines, not boxes. Measured values are set in IBM Plex Mono.</w:t>
+        <w:t xml:space="preserve">Tables use hairlines, not boxes. Measured values are set in IBM Plex Mono and aligned right.</w:t>
+      </w:r>
+    </w:p>
+    <w:p>
+      <w:pPr>
+        <w:pStyle w:val="Heading2"/>
+      </w:pPr>
+      <w:r>
+        <w:t xml:space="preserve">Quotes</w:t>
+      </w:r>
+    </w:p>
+    <w:p>
+      <w:pPr>
+        <w:pStyle w:val="Quote"/>
+      </w:pPr>
+      <w:r>
+        <w:t xml:space="preserve">“The index told us what the stopwatch never could: who gets faster when it matters.”</w:t>
+      </w:r>
+    </w:p>
+    <w:p>
+      <w:pPr>
+        <w:pStyle w:val="Caption"/>
+      </w:pPr>
+      <w:r>
+        <w:t xml:space="preserve">Head of driver development, FAT Racing</w:t>
       </w:r>
     </w:p>
     <w:p>
@@ -770,8 +1016,8 @@
       </w:r>
     </w:p>
     <w:sectPr>
-      <w:headerReference w:type="default" r:id="rId7"/>
-      <w:footerReference w:type="default" r:id="rId8"/>
+      <w:headerReference w:type="default" r:id="rId9"/>
+      <w:footerReference w:type="default" r:id="rId10"/>
       <w:pgSz w:w="11906" w:h="16838" w:orient="portrait"/>
       <w:pgMar w:top="1440" w:right="1440" w:bottom="1300" w:left="1440" w:header="600" w:footer="560" w:gutter="0"/>
       <w:pgNumType/>
@@ -823,9 +1069,14 @@
 </file>
 
 <file path=word/footer1.xml><?xml version="1.0" encoding="utf-8"?>
+<w:ftr xmlns:wpc="http://schemas.microsoft.com/office/word/2010/wordprocessingCanvas" xmlns:mc="http://schemas.openxmlformats.org/markup-compatibility/2006" xmlns:o="urn:schemas-microsoft-com:office:office" xmlns:r="http://schemas.openxmlformats.org/officeDocument/2006/relationships" xmlns:m="http://schemas.openxmlformats.org/officeDocument/2006/math" xmlns:v="urn:schemas-microsoft-com:vml" xmlns:wp14="http://schemas.microsoft.com/office/word/2010/wordprocessingDrawing" xmlns:wp="http://schemas.openxmlformats.org/drawingml/2006/wordprocessingDrawing" xmlns:w10="urn:schemas-microsoft-com:office:word" xmlns:w="http://schemas.openxmlformats.org/wordprocessingml/2006/main" xmlns:w14="http://schemas.microsoft.com/office/word/2010/wordml" xmlns:w15="http://schemas.microsoft.com/office/word/2012/wordml" xmlns:wpg="http://schemas.microsoft.com/office/word/2010/wordprocessingGroup" xmlns:wpi="http://schemas.microsoft.com/office/word/2010/wordprocessingInk" xmlns:wne="http://schemas.microsoft.com/office/word/2006/wordml" xmlns:wps="http://schemas.microsoft.com/office/word/2010/wordprocessingShape"/>
+</file>
+
+<file path=word/footer2.xml><?xml version="1.0" encoding="utf-8"?>
 <w:ftr xmlns:wpc="http://schemas.microsoft.com/office/word/2010/wordprocessingCanvas" xmlns:mc="http://schemas.openxmlformats.org/markup-compatibility/2006" xmlns:o="urn:schemas-microsoft-com:office:office" xmlns:r="http://schemas.openxmlformats.org/officeDocument/2006/relationships" xmlns:m="http://schemas.openxmlformats.org/officeDocument/2006/math" xmlns:v="urn:schemas-microsoft-com:vml" xmlns:wp14="http://schemas.microsoft.com/office/word/2010/wordprocessingDrawing" xmlns:wp="http://schemas.openxmlformats.org/drawingml/2006/wordprocessingDrawing" xmlns:w10="urn:schemas-microsoft-com:office:word" xmlns:w="http://schemas.openxmlformats.org/wordprocessingml/2006/main" xmlns:w14="http://schemas.microsoft.com/office/word/2010/wordml" xmlns:w15="http://schemas.microsoft.com/office/word/2012/wordml" xmlns:wpg="http://schemas.microsoft.com/office/word/2010/wordprocessingGroup" xmlns:wpi="http://schemas.microsoft.com/office/word/2010/wordprocessingInk" xmlns:wne="http://schemas.microsoft.com/office/word/2006/wordml" xmlns:wps="http://schemas.microsoft.com/office/word/2010/wordprocessingShape">
   <w:p>
     <w:pPr>
+      <w:pStyle w:val="Small"/>
       <w:pBdr>
         <w:top w:val="single" w:color="D9DADD" w:sz="4" w:space="8"/>
       </w:pBdr>
@@ -834,24 +1085,17 @@
       </w:tabs>
     </w:pPr>
     <w:r>
-      <w:rPr>
-        <w:rFonts w:ascii="IBM Plex Mono" w:cs="IBM Plex Mono" w:eastAsia="IBM Plex Mono" w:hAnsi="IBM Plex Mono"/>
-        <w:color w:val="585D65"/>
-        <w:sz w:val="15"/>
-        <w:szCs w:val="15"/>
-      </w:rPr>
       <w:t xml:space="preserve">Smedley Group</w:t>
     </w:r>
     <w:r>
-      <w:rPr>
-        <w:rFonts w:ascii="IBM Plex Mono" w:cs="IBM Plex Mono" w:eastAsia="IBM Plex Mono" w:hAnsi="IBM Plex Mono"/>
-        <w:color w:val="585D65"/>
-        <w:sz w:val="15"/>
-        <w:szCs w:val="15"/>
-      </w:rPr>
       <w:t xml:space="preserve">	</w:t>
       <w:fldChar w:fldCharType="begin"/>
       <w:instrText xml:space="preserve">PAGE</w:instrText>
+      <w:fldChar w:fldCharType="separate"/>
+      <w:fldChar w:fldCharType="end"/>
+      <w:t xml:space="preserve"> / </w:t>
+      <w:fldChar w:fldCharType="begin"/>
+      <w:instrText xml:space="preserve">NUMPAGES</w:instrText>
       <w:fldChar w:fldCharType="separate"/>
       <w:fldChar w:fldCharType="end"/>
     </w:r>
@@ -897,14 +1141,23 @@
 </file>
 
 <file path=word/header1.xml><?xml version="1.0" encoding="utf-8"?>
+<w:hdr xmlns:wpc="http://schemas.microsoft.com/office/word/2010/wordprocessingCanvas" xmlns:mc="http://schemas.openxmlformats.org/markup-compatibility/2006" xmlns:o="urn:schemas-microsoft-com:office:office" xmlns:r="http://schemas.openxmlformats.org/officeDocument/2006/relationships" xmlns:m="http://schemas.openxmlformats.org/officeDocument/2006/math" xmlns:v="urn:schemas-microsoft-com:vml" xmlns:wp14="http://schemas.microsoft.com/office/word/2010/wordprocessingDrawing" xmlns:wp="http://schemas.openxmlformats.org/drawingml/2006/wordprocessingDrawing" xmlns:w10="urn:schemas-microsoft-com:office:word" xmlns:w="http://schemas.openxmlformats.org/wordprocessingml/2006/main" xmlns:w14="http://schemas.microsoft.com/office/word/2010/wordml" xmlns:w15="http://schemas.microsoft.com/office/word/2012/wordml" xmlns:wpg="http://schemas.microsoft.com/office/word/2010/wordprocessingGroup" xmlns:wpi="http://schemas.microsoft.com/office/word/2010/wordprocessingInk" xmlns:wne="http://schemas.microsoft.com/office/word/2006/wordml" xmlns:wps="http://schemas.microsoft.com/office/word/2010/wordprocessingShape" xmlns:cx="http://schemas.microsoft.com/office/drawing/2014/chartex" xmlns:cx1="http://schemas.microsoft.com/office/drawing/2015/9/8/chartex" xmlns:cx2="http://schemas.microsoft.com/office/drawing/2015/10/21/chartex" xmlns:cx3="http://schemas.microsoft.com/office/drawing/2016/5/9/chartex" xmlns:cx4="http://schemas.microsoft.com/office/drawing/2016/5/10/chartex" xmlns:cx5="http://schemas.microsoft.com/office/drawing/2016/5/11/chartex" xmlns:cx6="http://schemas.microsoft.com/office/drawing/2016/5/12/chartex" xmlns:cx7="http://schemas.microsoft.com/office/drawing/2016/5/13/chartex" xmlns:cx8="http://schemas.microsoft.com/office/drawing/2016/5/14/chartex" xmlns:w16cid="http://schemas.microsoft.com/office/word/2016/wordml/cid" xmlns:w16se="http://schemas.microsoft.com/office/word/2015/wordml/symex"/>
+</file>
+
+<file path=word/header2.xml><?xml version="1.0" encoding="utf-8"?>
 <w:hdr xmlns:wpc="http://schemas.microsoft.com/office/word/2010/wordprocessingCanvas" xmlns:mc="http://schemas.openxmlformats.org/markup-compatibility/2006" xmlns:o="urn:schemas-microsoft-com:office:office" xmlns:r="http://schemas.openxmlformats.org/officeDocument/2006/relationships" xmlns:m="http://schemas.openxmlformats.org/officeDocument/2006/math" xmlns:v="urn:schemas-microsoft-com:vml" xmlns:wp14="http://schemas.microsoft.com/office/word/2010/wordprocessingDrawing" xmlns:wp="http://schemas.openxmlformats.org/drawingml/2006/wordprocessingDrawing" xmlns:w10="urn:schemas-microsoft-com:office:word" xmlns:w="http://schemas.openxmlformats.org/wordprocessingml/2006/main" xmlns:w14="http://schemas.microsoft.com/office/word/2010/wordml" xmlns:w15="http://schemas.microsoft.com/office/word/2012/wordml" xmlns:wpg="http://schemas.microsoft.com/office/word/2010/wordprocessingGroup" xmlns:wpi="http://schemas.microsoft.com/office/word/2010/wordprocessingInk" xmlns:wne="http://schemas.microsoft.com/office/word/2006/wordml" xmlns:wps="http://schemas.microsoft.com/office/word/2010/wordprocessingShape" xmlns:cx="http://schemas.microsoft.com/office/drawing/2014/chartex" xmlns:cx1="http://schemas.microsoft.com/office/drawing/2015/9/8/chartex" xmlns:cx2="http://schemas.microsoft.com/office/drawing/2015/10/21/chartex" xmlns:cx3="http://schemas.microsoft.com/office/drawing/2016/5/9/chartex" xmlns:cx4="http://schemas.microsoft.com/office/drawing/2016/5/10/chartex" xmlns:cx5="http://schemas.microsoft.com/office/drawing/2016/5/11/chartex" xmlns:cx6="http://schemas.microsoft.com/office/drawing/2016/5/12/chartex" xmlns:cx7="http://schemas.microsoft.com/office/drawing/2016/5/13/chartex" xmlns:cx8="http://schemas.microsoft.com/office/drawing/2016/5/14/chartex" xmlns:w16cid="http://schemas.microsoft.com/office/word/2016/wordml/cid" xmlns:w16se="http://schemas.microsoft.com/office/word/2015/wordml/symex">
   <w:p>
+    <w:pPr>
+      <w:tabs>
+        <w:tab w:val="right" w:pos="9026"/>
+      </w:tabs>
+    </w:pPr>
     <w:r>
       <w:drawing>
         <wp:inline distT="0" distB="0" distL="0" distR="0">
-          <wp:extent cx="923925" cy="400050"/>
+          <wp:extent cx="190500" cy="285750"/>
           <wp:effectExtent t="0" r="0" b="0" l="0"/>
-          <wp:docPr id="1" name="" descr="" title=""/>
+          <wp:docPr id="1" name="Smedley Group" descr="Smedley Group" title="Smedley Group"/>
           <wp:cNvGraphicFramePr>
             <a:graphicFrameLocks xmlns:a="http://schemas.openxmlformats.org/drawingml/2006/main" noChangeAspect="1"/>
           </wp:cNvGraphicFramePr>
@@ -927,7 +1180,7 @@
                 <pic:spPr bwMode="auto">
                   <a:xfrm>
                     <a:off x="0" y="0"/>
-                    <a:ext cx="923925" cy="400050"/>
+                    <a:ext cx="190500" cy="285750"/>
                   </a:xfrm>
                   <a:prstGeom prst="rect">
                     <a:avLst/>
@@ -938,6 +1191,15 @@
           </a:graphic>
         </wp:inline>
       </w:drawing>
+    </w:r>
+    <w:r>
+      <w:rPr>
+        <w:rFonts w:ascii="IBM Plex Mono" w:cs="IBM Plex Mono" w:eastAsia="IBM Plex Mono" w:hAnsi="IBM Plex Mono"/>
+        <w:color w:val="585D65"/>
+        <w:sz w:val="15"/>
+        <w:szCs w:val="15"/>
+      </w:rPr>
+      <w:t xml:space="preserve">	Document title</w:t>
     </w:r>
   </w:p>
 </w:hdr>
@@ -1044,6 +1306,22 @@
       </w:rPr>
     </w:lvl>
   </w:abstractNum>
+  <w:abstractNum w:abstractNumId="3" w15:restartNumberingAfterBreak="0">
+    <w:multiLevelType w:val="hybridMultilevel"/>
+    <w:lvl w:ilvl="0" w15:tentative="1">
+      <w:start w:val="1"/>
+      <w:numFmt w:val="decimalZero"/>
+      <w:lvlText w:val="%1"/>
+      <w:lvlJc w:val="left"/>
+      <w:pPr>
+        <w:ind w:left="480" w:hanging="480"/>
+      </w:pPr>
+      <w:rPr>
+        <w:rFonts w:ascii="IBM Plex Mono" w:cs="IBM Plex Mono" w:eastAsia="IBM Plex Mono" w:hAnsi="IBM Plex Mono"/>
+        <w:color w:val="1F66E0"/>
+      </w:rPr>
+    </w:lvl>
+  </w:abstractNum>
   <w:num w:numId="1">
     <w:abstractNumId w:val="1"/>
     <w:lvlOverride w:ilvl="0">
@@ -1052,6 +1330,12 @@
   </w:num>
   <w:num w:numId="2">
     <w:abstractNumId w:val="2"/>
+    <w:lvlOverride w:ilvl="0">
+      <w:startOverride w:val="1"/>
+    </w:lvlOverride>
+  </w:num>
+  <w:num w:numId="3">
+    <w:abstractNumId w:val="3"/>
     <w:lvlOverride w:ilvl="0">
       <w:startOverride w:val="1"/>
     </w:lvlOverride>
@@ -1070,7 +1354,11 @@
         <w:szCs w:val="20"/>
       </w:rPr>
     </w:rPrDefault>
-    <w:pPrDefault/>
+    <w:pPrDefault>
+      <w:pPr>
+        <w:spacing w:after="160" w:line="300"/>
+      </w:pPr>
+    </w:pPrDefault>
   </w:docDefaults>
   <w:style w:type="paragraph" w:styleId="Title">
     <w:name w:val="Title"/>
@@ -1249,13 +1537,13 @@
     <w:next w:val="Subtitle"/>
     <w:qFormat/>
     <w:pPr>
-      <w:spacing w:after="120" w:before="0" w:line="264"/>
+      <w:spacing w:after="160" w:before="0" w:line="252"/>
     </w:pPr>
     <w:rPr>
       <w:rFonts w:ascii="Sora SemiBold" w:cs="Sora SemiBold" w:eastAsia="Sora SemiBold" w:hAnsi="Sora SemiBold"/>
       <w:color w:val="0B0C0E"/>
-      <w:sz w:val="56"/>
-      <w:szCs w:val="56"/>
+      <w:sz w:val="64"/>
+      <w:szCs w:val="64"/>
     </w:rPr>
   </w:style>
   <w:style w:type="paragraph" w:styleId="Subtitle">
@@ -1264,13 +1552,13 @@
     <w:next w:val="Body"/>
     <w:qFormat/>
     <w:pPr>
-      <w:spacing w:after="360"/>
+      <w:spacing w:after="480" w:line="320"/>
     </w:pPr>
     <w:rPr>
       <w:rFonts w:ascii="Sora Light" w:cs="Sora Light" w:eastAsia="Sora Light" w:hAnsi="Sora Light"/>
       <w:color w:val="585D65"/>
-      <w:sz w:val="28"/>
-      <w:szCs w:val="28"/>
+      <w:sz w:val="30"/>
+      <w:szCs w:val="30"/>
     </w:rPr>
   </w:style>
   <w:style w:type="paragraph" w:styleId="Heading1">
@@ -1280,14 +1568,15 @@
     <w:qFormat/>
     <w:pPr>
       <w:keepNext/>
-      <w:spacing w:after="140" w:before="400"/>
+      <w:keepLines/>
+      <w:spacing w:after="160" w:before="480" w:line="264"/>
       <w:outlineLvl w:val="0"/>
     </w:pPr>
     <w:rPr>
       <w:rFonts w:ascii="Sora SemiBold" w:cs="Sora SemiBold" w:eastAsia="Sora SemiBold" w:hAnsi="Sora SemiBold"/>
       <w:color w:val="0B0C0E"/>
-      <w:sz w:val="32"/>
-      <w:szCs w:val="32"/>
+      <w:sz w:val="34"/>
+      <w:szCs w:val="34"/>
     </w:rPr>
   </w:style>
   <w:style w:type="paragraph" w:styleId="Heading2">
@@ -1297,14 +1586,32 @@
     <w:qFormat/>
     <w:pPr>
       <w:keepNext/>
-      <w:spacing w:after="100" w:before="320"/>
+      <w:keepLines/>
+      <w:spacing w:after="120" w:before="360"/>
       <w:outlineLvl w:val="1"/>
     </w:pPr>
     <w:rPr>
       <w:rFonts w:ascii="Sora SemiBold" w:cs="Sora SemiBold" w:eastAsia="Sora SemiBold" w:hAnsi="Sora SemiBold"/>
       <w:color w:val="0B0C0E"/>
-      <w:sz w:val="22"/>
-      <w:szCs w:val="22"/>
+      <w:sz w:val="24"/>
+      <w:szCs w:val="24"/>
+    </w:rPr>
+  </w:style>
+  <w:style w:type="paragraph" w:styleId="Heading3">
+    <w:name w:val="Heading 3"/>
+    <w:basedOn w:val="Normal"/>
+    <w:next w:val="Body"/>
+    <w:qFormat/>
+    <w:pPr>
+      <w:keepNext/>
+      <w:spacing w:after="80" w:before="280"/>
+      <w:outlineLvl w:val="2"/>
+    </w:pPr>
+    <w:rPr>
+      <w:rFonts w:ascii="IBM Plex Mono" w:cs="IBM Plex Mono" w:eastAsia="IBM Plex Mono" w:hAnsi="IBM Plex Mono"/>
+      <w:color w:val="1F66E0"/>
+      <w:sz w:val="17"/>
+      <w:szCs w:val="17"/>
     </w:rPr>
   </w:style>
   <w:style w:type="paragraph" w:styleId="Body">
@@ -1327,7 +1634,7 @@
     <w:next w:val="Body"/>
     <w:qFormat/>
     <w:pPr>
-      <w:spacing w:after="240" w:line="320"/>
+      <w:spacing w:after="240" w:line="336"/>
     </w:pPr>
     <w:rPr>
       <w:rFonts w:ascii="Sora" w:cs="Sora" w:eastAsia="Sora" w:hAnsi="Sora"/>
@@ -1342,7 +1649,7 @@
     <w:next w:val="Title"/>
     <w:qFormat/>
     <w:pPr>
-      <w:spacing w:after="120"/>
+      <w:spacing w:after="160"/>
     </w:pPr>
     <w:rPr>
       <w:rFonts w:ascii="IBM Plex Mono" w:cs="IBM Plex Mono" w:eastAsia="IBM Plex Mono" w:hAnsi="IBM Plex Mono"/>
@@ -1357,7 +1664,7 @@
     <w:next w:val="Body"/>
     <w:qFormat/>
     <w:pPr>
-      <w:spacing w:after="240" w:before="80"/>
+      <w:spacing w:after="240" w:before="80" w:line="260"/>
     </w:pPr>
     <w:rPr>
       <w:rFonts w:ascii="IBM Plex Mono" w:cs="IBM Plex Mono" w:eastAsia="IBM Plex Mono" w:hAnsi="IBM Plex Mono"/>
@@ -1369,16 +1676,52 @@
   <w:style w:type="paragraph" w:styleId="Figure">
     <w:name w:val="Figure"/>
     <w:basedOn w:val="Normal"/>
-    <w:next w:val="Body"/>
+    <w:next w:val="Caption"/>
     <w:qFormat/>
     <w:pPr>
-      <w:spacing w:after="0" w:before="120"/>
+      <w:keepNext/>
+      <w:spacing w:after="0" w:before="160" w:line="240"/>
     </w:pPr>
     <w:rPr>
       <w:rFonts w:ascii="Sora SemiBold" w:cs="Sora SemiBold" w:eastAsia="Sora SemiBold" w:hAnsi="Sora SemiBold"/>
       <w:color w:val="0B0C0E"/>
-      <w:sz w:val="64"/>
-      <w:szCs w:val="64"/>
+      <w:sz w:val="72"/>
+      <w:szCs w:val="72"/>
+    </w:rPr>
+  </w:style>
+  <w:style w:type="paragraph" w:styleId="Note">
+    <w:name w:val="Note"/>
+    <w:basedOn w:val="Body"/>
+    <w:next w:val="Body"/>
+    <w:qFormat/>
+    <w:pPr>
+      <w:pBdr>
+        <w:left w:val="single" w:color="1F66E0" w:sz="18" w:space="12"/>
+      </w:pBdr>
+      <w:spacing w:after="240" w:before="120"/>
+      <w:ind w:left="240"/>
+    </w:pPr>
+    <w:rPr>
+      <w:color w:val="0B0C0E"/>
+    </w:rPr>
+  </w:style>
+  <w:style w:type="paragraph" w:styleId="Quote">
+    <w:name w:val="Quote"/>
+    <w:basedOn w:val="Normal"/>
+    <w:next w:val="Caption"/>
+    <w:qFormat/>
+    <w:pPr>
+      <w:pBdr>
+        <w:top w:val="single" w:color="D8231A" w:sz="18" w:space="14"/>
+      </w:pBdr>
+      <w:spacing w:after="80" w:before="360" w:line="360"/>
+      <w:ind w:right="1440"/>
+    </w:pPr>
+    <w:rPr>
+      <w:rFonts w:ascii="Sora Light" w:cs="Sora Light" w:eastAsia="Sora Light" w:hAnsi="Sora Light"/>
+      <w:color w:val="0B0C0E"/>
+      <w:sz w:val="30"/>
+      <w:szCs w:val="30"/>
     </w:rPr>
   </w:style>
   <w:style w:type="paragraph" w:styleId="Strapline">
@@ -1402,5 +1745,19 @@
       <w:szCs w:val="22"/>
     </w:rPr>
   </w:style>
+  <w:style w:type="paragraph" w:styleId="Small">
+    <w:name w:val="Small"/>
+    <w:basedOn w:val="Normal"/>
+    <w:qFormat/>
+    <w:pPr>
+      <w:spacing w:after="0" w:line="240"/>
+    </w:pPr>
+    <w:rPr>
+      <w:rFonts w:ascii="IBM Plex Mono" w:cs="IBM Plex Mono" w:eastAsia="IBM Plex Mono" w:hAnsi="IBM Plex Mono"/>
+      <w:color w:val="585D65"/>
+      <w:sz w:val="15"/>
+      <w:szCs w:val="15"/>
+    </w:rPr>
+  </w:style>
 </w:styles>
 </file>
</xml_diff>

<commit_message>
Templates: slides, documents and signatures rebuilt to the TalentID slide system
The deck follows the PDF's layout page: 16:9 on the Canvas, the title at 0.44 in, the four-column grid,
the strapline band full bleed at 4.37 in and the logo at 0.50, 4.96 in. Content cards and covers take the
45 degree signature gradient and the edge light through an XML pass after pptxgenjs, with solid fallbacks.
Documents are Sora on white paper with Ink and Slate type and Pale Blue rules; signatures are monochrome.
LibreOffice previews render with Sora through a private font configuration.

Co-Authored-By: Claude Opus 5.5 (1M context) <noreply@anthropic.com>
</commit_message>
<xml_diff>
--- a/assets/templates/smedley-group-document.docx
+++ b/assets/templates/smedley-group-document.docx
@@ -73,48 +73,12 @@
     </w:p>
     <w:p>
       <w:pPr>
-        <w:spacing w:after="200"/>
-      </w:pPr>
-      <w:r>
-        <w:drawing>
-          <wp:inline distT="0" distB="0" distL="0" distR="0">
-            <wp:extent cx="5734050" cy="85725"/>
-            <wp:effectExtent t="0" r="0" b="0" l="0"/>
-            <wp:docPr id="1" name="Rule" descr="Red lead into a blue scale rule" title="Scale rule"/>
-            <wp:cNvGraphicFramePr>
-              <a:graphicFrameLocks xmlns:a="http://schemas.openxmlformats.org/drawingml/2006/main" noChangeAspect="1"/>
-            </wp:cNvGraphicFramePr>
-            <a:graphic xmlns:a="http://schemas.openxmlformats.org/drawingml/2006/main">
-              <a:graphicData uri="http://schemas.openxmlformats.org/drawingml/2006/picture">
-                <pic:pic xmlns:pic="http://schemas.openxmlformats.org/drawingml/2006/picture">
-                  <pic:nvPicPr>
-                    <pic:cNvPr id="0" name="" descr=""/>
-                    <pic:cNvPicPr>
-                      <a:picLocks noChangeAspect="1" noChangeArrowheads="1"/>
-                    </pic:cNvPicPr>
-                  </pic:nvPicPr>
-                  <pic:blipFill>
-                    <a:blip r:embed="rId12" cstate="none"/>
-                    <a:srcRect/>
-                    <a:stretch>
-                      <a:fillRect/>
-                    </a:stretch>
-                  </pic:blipFill>
-                  <pic:spPr bwMode="auto">
-                    <a:xfrm>
-                      <a:off x="0" y="0"/>
-                      <a:ext cx="5734050" cy="85725"/>
-                    </a:xfrm>
-                    <a:prstGeom prst="rect">
-                      <a:avLst/>
-                    </a:prstGeom>
-                  </pic:spPr>
-                </pic:pic>
-              </a:graphicData>
-            </a:graphic>
-          </wp:inline>
-        </w:drawing>
-      </w:r>
+        <w:pBdr>
+          <w:bottom w:val="single" w:color="ABC0E4" w:sz="6" w:space="1"/>
+        </w:pBdr>
+        <w:spacing w:after="240"/>
+        <w:ind w:right="3000"/>
+      </w:pPr>
     </w:p>
     <w:p>
       <w:pPr>
@@ -125,9 +89,9 @@
       </w:r>
       <w:r>
         <w:rPr>
-          <w:color w:val="585D65"/>
+          <w:color w:val="333F50"/>
         </w:rPr>
-        <w:t xml:space="preserve">   September 2026   </w:t>
+        <w:t xml:space="preserve">   5 October 2026   </w:t>
       </w:r>
       <w:r>
         <w:t xml:space="preserve">Version 1.0</w:t>
@@ -220,7 +184,7 @@
         <w:pStyle w:val="Note"/>
       </w:pPr>
       <w:r>
-        <w:t xml:space="preserve">Notes carry an aside the reader should not miss: a caveat, a dependency, a decision still open. They sit on a blue rule.</w:t>
+        <w:t xml:space="preserve">Notes carry an aside the reader should not miss: a caveat, a dependency, a decision still open. They sit on a Pale Blue rule.</w:t>
       </w:r>
     </w:p>
     <w:p>
@@ -257,7 +221,7 @@
         <w:spacing w:after="80"/>
       </w:pPr>
       <w:r>
-        <w:t xml:space="preserve">Lists use an en rule in Race Red, never a literal bullet character</w:t>
+        <w:t xml:space="preserve">Lists use an en rule in Steel, never a literal bullet character</w:t>
       </w:r>
     </w:p>
     <w:p>
@@ -292,7 +256,7 @@
         <w:spacing w:before="200"/>
       </w:pPr>
       <w:r>
-        <w:t xml:space="preserve">Steps in order are numbered in mono.</w:t>
+        <w:t xml:space="preserve">Steps in order are numbered in Sora SemiBold.</w:t>
       </w:r>
     </w:p>
     <w:p>
@@ -351,7 +315,7 @@
       </w:r>
       <w:r>
         <w:rPr>
-          <w:color w:val="D8231A"/>
+          <w:color w:val="44546A"/>
           <w:sz w:val="36"/>
           <w:szCs w:val="36"/>
         </w:rPr>
@@ -363,7 +327,7 @@
         <w:pStyle w:val="Caption"/>
       </w:pPr>
       <w:r>
-        <w:t xml:space="preserve">Figure: one hero number, Sora SemiBold, with its unit in red</w:t>
+        <w:t xml:space="preserve">Figure: one hero number, Sora SemiBold, with its unit in Steel</w:t>
       </w:r>
     </w:p>
     <w:p>
@@ -403,7 +367,7 @@
             <w:tcBorders>
               <w:top w:val="none" w:color="FFFFFF" w:sz="0"/>
               <w:left w:val="none" w:color="FFFFFF" w:sz="0"/>
-              <w:bottom w:val="single" w:color="D9DADD" w:sz="4"/>
+              <w:bottom w:val="single" w:color="ABC0E4" w:sz="4"/>
               <w:right w:val="none" w:color="FFFFFF" w:sz="0"/>
             </w:tcBorders>
             <w:tcMar>
@@ -437,7 +401,7 @@
             <w:tcBorders>
               <w:top w:val="none" w:color="FFFFFF" w:sz="0"/>
               <w:left w:val="none" w:color="FFFFFF" w:sz="0"/>
-              <w:bottom w:val="single" w:color="D9DADD" w:sz="4"/>
+              <w:bottom w:val="single" w:color="ABC0E4" w:sz="4"/>
               <w:right w:val="none" w:color="FFFFFF" w:sz="0"/>
             </w:tcBorders>
             <w:tcMar>
@@ -471,7 +435,7 @@
             <w:tcBorders>
               <w:top w:val="none" w:color="FFFFFF" w:sz="0"/>
               <w:left w:val="none" w:color="FFFFFF" w:sz="0"/>
-              <w:bottom w:val="single" w:color="D9DADD" w:sz="4"/>
+              <w:bottom w:val="single" w:color="ABC0E4" w:sz="4"/>
               <w:right w:val="none" w:color="FFFFFF" w:sz="0"/>
             </w:tcBorders>
             <w:tcMar>
@@ -505,7 +469,7 @@
             <w:tcBorders>
               <w:top w:val="none" w:color="FFFFFF" w:sz="0"/>
               <w:left w:val="none" w:color="FFFFFF" w:sz="0"/>
-              <w:bottom w:val="single" w:color="D9DADD" w:sz="4"/>
+              <w:bottom w:val="single" w:color="ABC0E4" w:sz="4"/>
               <w:right w:val="none" w:color="FFFFFF" w:sz="0"/>
             </w:tcBorders>
             <w:tcMar>
@@ -544,7 +508,7 @@
             <w:tcBorders>
               <w:top w:val="none" w:color="FFFFFF" w:sz="0"/>
               <w:left w:val="none" w:color="FFFFFF" w:sz="0"/>
-              <w:bottom w:val="single" w:color="D9DADD" w:sz="4"/>
+              <w:bottom w:val="single" w:color="ABC0E4" w:sz="4"/>
               <w:right w:val="none" w:color="FFFFFF" w:sz="0"/>
             </w:tcBorders>
             <w:tcMar>
@@ -578,7 +542,7 @@
             <w:tcBorders>
               <w:top w:val="none" w:color="FFFFFF" w:sz="0"/>
               <w:left w:val="none" w:color="FFFFFF" w:sz="0"/>
-              <w:bottom w:val="single" w:color="D9DADD" w:sz="4"/>
+              <w:bottom w:val="single" w:color="ABC0E4" w:sz="4"/>
               <w:right w:val="none" w:color="FFFFFF" w:sz="0"/>
             </w:tcBorders>
             <w:tcMar>
@@ -612,7 +576,7 @@
             <w:tcBorders>
               <w:top w:val="none" w:color="FFFFFF" w:sz="0"/>
               <w:left w:val="none" w:color="FFFFFF" w:sz="0"/>
-              <w:bottom w:val="single" w:color="D9DADD" w:sz="4"/>
+              <w:bottom w:val="single" w:color="ABC0E4" w:sz="4"/>
               <w:right w:val="none" w:color="FFFFFF" w:sz="0"/>
             </w:tcBorders>
             <w:tcMar>
@@ -633,7 +597,6 @@
             </w:pPr>
             <w:r>
               <w:rPr>
-                <w:rFonts w:ascii="IBM Plex Mono" w:cs="IBM Plex Mono" w:eastAsia="IBM Plex Mono" w:hAnsi="IBM Plex Mono"/>
                 <w:b w:val="false"/>
                 <w:bCs w:val="false"/>
               </w:rPr>
@@ -647,7 +610,7 @@
             <w:tcBorders>
               <w:top w:val="none" w:color="FFFFFF" w:sz="0"/>
               <w:left w:val="none" w:color="FFFFFF" w:sz="0"/>
-              <w:bottom w:val="single" w:color="D9DADD" w:sz="4"/>
+              <w:bottom w:val="single" w:color="ABC0E4" w:sz="4"/>
               <w:right w:val="none" w:color="FFFFFF" w:sz="0"/>
             </w:tcBorders>
             <w:tcMar>
@@ -668,10 +631,9 @@
             </w:pPr>
             <w:r>
               <w:rPr>
-                <w:rFonts w:ascii="IBM Plex Mono" w:cs="IBM Plex Mono" w:eastAsia="IBM Plex Mono" w:hAnsi="IBM Plex Mono"/>
                 <w:b w:val="false"/>
                 <w:bCs w:val="false"/>
-                <w:color w:val="007A38"/>
+                <w:color w:val="007A3D"/>
               </w:rPr>
               <w:t xml:space="preserve">+3.2</w:t>
             </w:r>
@@ -688,7 +650,7 @@
             <w:tcBorders>
               <w:top w:val="none" w:color="FFFFFF" w:sz="0"/>
               <w:left w:val="none" w:color="FFFFFF" w:sz="0"/>
-              <w:bottom w:val="single" w:color="D9DADD" w:sz="4"/>
+              <w:bottom w:val="single" w:color="ABC0E4" w:sz="4"/>
               <w:right w:val="none" w:color="FFFFFF" w:sz="0"/>
             </w:tcBorders>
             <w:tcMar>
@@ -722,7 +684,7 @@
             <w:tcBorders>
               <w:top w:val="none" w:color="FFFFFF" w:sz="0"/>
               <w:left w:val="none" w:color="FFFFFF" w:sz="0"/>
-              <w:bottom w:val="single" w:color="D9DADD" w:sz="4"/>
+              <w:bottom w:val="single" w:color="ABC0E4" w:sz="4"/>
               <w:right w:val="none" w:color="FFFFFF" w:sz="0"/>
             </w:tcBorders>
             <w:tcMar>
@@ -756,7 +718,7 @@
             <w:tcBorders>
               <w:top w:val="none" w:color="FFFFFF" w:sz="0"/>
               <w:left w:val="none" w:color="FFFFFF" w:sz="0"/>
-              <w:bottom w:val="single" w:color="D9DADD" w:sz="4"/>
+              <w:bottom w:val="single" w:color="ABC0E4" w:sz="4"/>
               <w:right w:val="none" w:color="FFFFFF" w:sz="0"/>
             </w:tcBorders>
             <w:tcMar>
@@ -777,7 +739,6 @@
             </w:pPr>
             <w:r>
               <w:rPr>
-                <w:rFonts w:ascii="IBM Plex Mono" w:cs="IBM Plex Mono" w:eastAsia="IBM Plex Mono" w:hAnsi="IBM Plex Mono"/>
                 <w:b w:val="false"/>
                 <w:bCs w:val="false"/>
               </w:rPr>
@@ -791,7 +752,7 @@
             <w:tcBorders>
               <w:top w:val="none" w:color="FFFFFF" w:sz="0"/>
               <w:left w:val="none" w:color="FFFFFF" w:sz="0"/>
-              <w:bottom w:val="single" w:color="D9DADD" w:sz="4"/>
+              <w:bottom w:val="single" w:color="ABC0E4" w:sz="4"/>
               <w:right w:val="none" w:color="FFFFFF" w:sz="0"/>
             </w:tcBorders>
             <w:tcMar>
@@ -812,10 +773,9 @@
             </w:pPr>
             <w:r>
               <w:rPr>
-                <w:rFonts w:ascii="IBM Plex Mono" w:cs="IBM Plex Mono" w:eastAsia="IBM Plex Mono" w:hAnsi="IBM Plex Mono"/>
                 <w:b w:val="false"/>
                 <w:bCs w:val="false"/>
-                <w:color w:val="007A38"/>
+                <w:color w:val="007A3D"/>
               </w:rPr>
               <w:t xml:space="preserve">+1.1</w:t>
             </w:r>
@@ -832,7 +792,7 @@
             <w:tcBorders>
               <w:top w:val="none" w:color="FFFFFF" w:sz="0"/>
               <w:left w:val="none" w:color="FFFFFF" w:sz="0"/>
-              <w:bottom w:val="single" w:color="D9DADD" w:sz="4"/>
+              <w:bottom w:val="single" w:color="ABC0E4" w:sz="4"/>
               <w:right w:val="none" w:color="FFFFFF" w:sz="0"/>
             </w:tcBorders>
             <w:tcMar>
@@ -866,7 +826,7 @@
             <w:tcBorders>
               <w:top w:val="none" w:color="FFFFFF" w:sz="0"/>
               <w:left w:val="none" w:color="FFFFFF" w:sz="0"/>
-              <w:bottom w:val="single" w:color="D9DADD" w:sz="4"/>
+              <w:bottom w:val="single" w:color="ABC0E4" w:sz="4"/>
               <w:right w:val="none" w:color="FFFFFF" w:sz="0"/>
             </w:tcBorders>
             <w:tcMar>
@@ -900,7 +860,7 @@
             <w:tcBorders>
               <w:top w:val="none" w:color="FFFFFF" w:sz="0"/>
               <w:left w:val="none" w:color="FFFFFF" w:sz="0"/>
-              <w:bottom w:val="single" w:color="D9DADD" w:sz="4"/>
+              <w:bottom w:val="single" w:color="ABC0E4" w:sz="4"/>
               <w:right w:val="none" w:color="FFFFFF" w:sz="0"/>
             </w:tcBorders>
             <w:tcMar>
@@ -921,7 +881,6 @@
             </w:pPr>
             <w:r>
               <w:rPr>
-                <w:rFonts w:ascii="IBM Plex Mono" w:cs="IBM Plex Mono" w:eastAsia="IBM Plex Mono" w:hAnsi="IBM Plex Mono"/>
                 <w:b w:val="false"/>
                 <w:bCs w:val="false"/>
               </w:rPr>
@@ -935,7 +894,7 @@
             <w:tcBorders>
               <w:top w:val="none" w:color="FFFFFF" w:sz="0"/>
               <w:left w:val="none" w:color="FFFFFF" w:sz="0"/>
-              <w:bottom w:val="single" w:color="D9DADD" w:sz="4"/>
+              <w:bottom w:val="single" w:color="ABC0E4" w:sz="4"/>
               <w:right w:val="none" w:color="FFFFFF" w:sz="0"/>
             </w:tcBorders>
             <w:tcMar>
@@ -956,10 +915,9 @@
             </w:pPr>
             <w:r>
               <w:rPr>
-                <w:rFonts w:ascii="IBM Plex Mono" w:cs="IBM Plex Mono" w:eastAsia="IBM Plex Mono" w:hAnsi="IBM Plex Mono"/>
                 <w:b w:val="false"/>
                 <w:bCs w:val="false"/>
-                <w:color w:val="007A38"/>
+                <w:color w:val="007A3D"/>
               </w:rPr>
               <w:t xml:space="preserve">+4.6</w:t>
             </w:r>
@@ -972,7 +930,7 @@
         <w:pStyle w:val="Caption"/>
       </w:pPr>
       <w:r>
-        <w:t xml:space="preserve">Tables use hairlines, not boxes. Measured values are set in IBM Plex Mono and aligned right.</w:t>
+        <w:t xml:space="preserve">Tables use Pale Blue hairlines, not boxes. Measured values take tabular figures and align right; a gain is a green label, never a filled cell.</w:t>
       </w:r>
     </w:p>
     <w:p>
@@ -1078,7 +1036,7 @@
     <w:pPr>
       <w:pStyle w:val="Small"/>
       <w:pBdr>
-        <w:top w:val="single" w:color="D9DADD" w:sz="4" w:space="8"/>
+        <w:top w:val="single" w:color="ABC0E4" w:sz="4" w:space="8"/>
       </w:pBdr>
       <w:tabs>
         <w:tab w:val="right" w:pos="9026"/>
@@ -1194,8 +1152,8 @@
     </w:r>
     <w:r>
       <w:rPr>
-        <w:rFonts w:ascii="IBM Plex Mono" w:cs="IBM Plex Mono" w:eastAsia="IBM Plex Mono" w:hAnsi="IBM Plex Mono"/>
-        <w:color w:val="585D65"/>
+        <w:rFonts w:ascii="Sora" w:cs="Sora" w:eastAsia="Sora" w:hAnsi="Sora"/>
+        <w:color w:val="333F50"/>
         <w:sz w:val="15"/>
         <w:szCs w:val="15"/>
       </w:rPr>
@@ -1302,7 +1260,7 @@
         <w:ind w:left="360" w:hanging="260"/>
       </w:pPr>
       <w:rPr>
-        <w:color w:val="D8231A"/>
+        <w:color w:val="44546A"/>
       </w:rPr>
     </w:lvl>
   </w:abstractNum>
@@ -1317,8 +1275,8 @@
         <w:ind w:left="480" w:hanging="480"/>
       </w:pPr>
       <w:rPr>
-        <w:rFonts w:ascii="IBM Plex Mono" w:cs="IBM Plex Mono" w:eastAsia="IBM Plex Mono" w:hAnsi="IBM Plex Mono"/>
-        <w:color w:val="1F66E0"/>
+        <w:rFonts w:ascii="Sora SemiBold" w:cs="Sora SemiBold" w:eastAsia="Sora SemiBold" w:hAnsi="Sora SemiBold"/>
+        <w:color w:val="44546A"/>
       </w:rPr>
     </w:lvl>
   </w:abstractNum>
@@ -1349,7 +1307,7 @@
     <w:rPrDefault>
       <w:rPr>
         <w:rFonts w:ascii="Sora" w:cs="Sora" w:eastAsia="Sora" w:hAnsi="Sora"/>
-        <w:color w:val="0B0C0E"/>
+        <w:color w:val="000000"/>
         <w:sz w:val="20"/>
         <w:szCs w:val="20"/>
       </w:rPr>
@@ -1541,7 +1499,7 @@
     </w:pPr>
     <w:rPr>
       <w:rFonts w:ascii="Sora SemiBold" w:cs="Sora SemiBold" w:eastAsia="Sora SemiBold" w:hAnsi="Sora SemiBold"/>
-      <w:color w:val="0B0C0E"/>
+      <w:color w:val="000000"/>
       <w:sz w:val="64"/>
       <w:szCs w:val="64"/>
     </w:rPr>
@@ -1556,7 +1514,7 @@
     </w:pPr>
     <w:rPr>
       <w:rFonts w:ascii="Sora Light" w:cs="Sora Light" w:eastAsia="Sora Light" w:hAnsi="Sora Light"/>
-      <w:color w:val="585D65"/>
+      <w:color w:val="333F50"/>
       <w:sz w:val="30"/>
       <w:szCs w:val="30"/>
     </w:rPr>
@@ -1574,7 +1532,7 @@
     </w:pPr>
     <w:rPr>
       <w:rFonts w:ascii="Sora SemiBold" w:cs="Sora SemiBold" w:eastAsia="Sora SemiBold" w:hAnsi="Sora SemiBold"/>
-      <w:color w:val="0B0C0E"/>
+      <w:color w:val="000000"/>
       <w:sz w:val="34"/>
       <w:szCs w:val="34"/>
     </w:rPr>
@@ -1592,7 +1550,7 @@
     </w:pPr>
     <w:rPr>
       <w:rFonts w:ascii="Sora SemiBold" w:cs="Sora SemiBold" w:eastAsia="Sora SemiBold" w:hAnsi="Sora SemiBold"/>
-      <w:color w:val="0B0C0E"/>
+      <w:color w:val="000000"/>
       <w:sz w:val="24"/>
       <w:szCs w:val="24"/>
     </w:rPr>
@@ -1608,8 +1566,10 @@
       <w:outlineLvl w:val="2"/>
     </w:pPr>
     <w:rPr>
-      <w:rFonts w:ascii="IBM Plex Mono" w:cs="IBM Plex Mono" w:eastAsia="IBM Plex Mono" w:hAnsi="IBM Plex Mono"/>
-      <w:color w:val="1F66E0"/>
+      <w:rFonts w:ascii="Sora SemiBold" w:cs="Sora SemiBold" w:eastAsia="Sora SemiBold" w:hAnsi="Sora SemiBold"/>
+      <w:caps/>
+      <w:color w:val="44546A"/>
+      <w:spacing w:val="30"/>
       <w:sz w:val="17"/>
       <w:szCs w:val="17"/>
     </w:rPr>
@@ -1623,7 +1583,7 @@
     </w:pPr>
     <w:rPr>
       <w:rFonts w:ascii="Sora" w:cs="Sora" w:eastAsia="Sora" w:hAnsi="Sora"/>
-      <w:color w:val="0B0C0E"/>
+      <w:color w:val="000000"/>
       <w:sz w:val="20"/>
       <w:szCs w:val="20"/>
     </w:rPr>
@@ -1638,7 +1598,7 @@
     </w:pPr>
     <w:rPr>
       <w:rFonts w:ascii="Sora" w:cs="Sora" w:eastAsia="Sora" w:hAnsi="Sora"/>
-      <w:color w:val="0B0C0E"/>
+      <w:color w:val="000000"/>
       <w:sz w:val="26"/>
       <w:szCs w:val="26"/>
     </w:rPr>
@@ -1652,8 +1612,10 @@
       <w:spacing w:after="160"/>
     </w:pPr>
     <w:rPr>
-      <w:rFonts w:ascii="IBM Plex Mono" w:cs="IBM Plex Mono" w:eastAsia="IBM Plex Mono" w:hAnsi="IBM Plex Mono"/>
-      <w:color w:val="1F66E0"/>
+      <w:rFonts w:ascii="Sora SemiBold" w:cs="Sora SemiBold" w:eastAsia="Sora SemiBold" w:hAnsi="Sora SemiBold"/>
+      <w:caps/>
+      <w:color w:val="44546A"/>
+      <w:spacing w:val="40"/>
       <w:sz w:val="17"/>
       <w:szCs w:val="17"/>
     </w:rPr>
@@ -1667,8 +1629,8 @@
       <w:spacing w:after="240" w:before="80" w:line="260"/>
     </w:pPr>
     <w:rPr>
-      <w:rFonts w:ascii="IBM Plex Mono" w:cs="IBM Plex Mono" w:eastAsia="IBM Plex Mono" w:hAnsi="IBM Plex Mono"/>
-      <w:color w:val="585D65"/>
+      <w:rFonts w:ascii="Sora Light" w:cs="Sora Light" w:eastAsia="Sora Light" w:hAnsi="Sora Light"/>
+      <w:color w:val="333F50"/>
       <w:sz w:val="16"/>
       <w:szCs w:val="16"/>
     </w:rPr>
@@ -1684,7 +1646,7 @@
     </w:pPr>
     <w:rPr>
       <w:rFonts w:ascii="Sora SemiBold" w:cs="Sora SemiBold" w:eastAsia="Sora SemiBold" w:hAnsi="Sora SemiBold"/>
-      <w:color w:val="0B0C0E"/>
+      <w:color w:val="000000"/>
       <w:sz w:val="72"/>
       <w:szCs w:val="72"/>
     </w:rPr>
@@ -1696,13 +1658,13 @@
     <w:qFormat/>
     <w:pPr>
       <w:pBdr>
-        <w:left w:val="single" w:color="1F66E0" w:sz="18" w:space="12"/>
+        <w:left w:val="single" w:color="ABC0E4" w:sz="18" w:space="12"/>
       </w:pBdr>
       <w:spacing w:after="240" w:before="120"/>
       <w:ind w:left="240"/>
     </w:pPr>
     <w:rPr>
-      <w:color w:val="0B0C0E"/>
+      <w:color w:val="000000"/>
     </w:rPr>
   </w:style>
   <w:style w:type="paragraph" w:styleId="Quote">
@@ -1712,14 +1674,14 @@
     <w:qFormat/>
     <w:pPr>
       <w:pBdr>
-        <w:top w:val="single" w:color="D8231A" w:sz="18" w:space="14"/>
+        <w:top w:val="single" w:color="ABC0E4" w:sz="18" w:space="14"/>
       </w:pBdr>
       <w:spacing w:after="80" w:before="360" w:line="360"/>
       <w:ind w:right="1440"/>
     </w:pPr>
     <w:rPr>
       <w:rFonts w:ascii="Sora Light" w:cs="Sora Light" w:eastAsia="Sora Light" w:hAnsi="Sora Light"/>
-      <w:color w:val="0B0C0E"/>
+      <w:color w:val="000000"/>
       <w:sz w:val="30"/>
       <w:szCs w:val="30"/>
     </w:rPr>
@@ -1731,10 +1693,10 @@
     <w:qFormat/>
     <w:pPr>
       <w:pBdr>
-        <w:top w:val="single" w:color="000000" w:sz="36" w:space="6"/>
-        <w:bottom w:val="single" w:color="000000" w:sz="36" w:space="6"/>
+        <w:top w:val="single" w:color="222A35" w:sz="36" w:space="6"/>
+        <w:bottom w:val="single" w:color="222A35" w:sz="36" w:space="6"/>
       </w:pBdr>
-      <w:shd w:fill="000000" w:color="auto" w:val="clear"/>
+      <w:shd w:fill="222A35" w:color="auto" w:val="clear"/>
       <w:spacing w:after="360" w:before="360"/>
       <w:jc w:val="center"/>
     </w:pPr>
@@ -1753,8 +1715,8 @@
       <w:spacing w:after="0" w:line="240"/>
     </w:pPr>
     <w:rPr>
-      <w:rFonts w:ascii="IBM Plex Mono" w:cs="IBM Plex Mono" w:eastAsia="IBM Plex Mono" w:hAnsi="IBM Plex Mono"/>
-      <w:color w:val="585D65"/>
+      <w:rFonts w:ascii="Sora" w:cs="Sora" w:eastAsia="Sora" w:hAnsi="Sora"/>
+      <w:color w:val="333F50"/>
       <w:sz w:val="15"/>
       <w:szCs w:val="15"/>
     </w:rPr>

</xml_diff>